<commit_message>
Deploy preview for PR 551 🛫
</commit_message>
<xml_diff>
--- a/pr-preview/pr-551/UCD-SeRG-Lab-Manual-tracked-changes.docx
+++ b/pr-preview/pr-551/UCD-SeRG-Lab-Manual-tracked-changes.docx
@@ -32259,7 +32259,7 @@
       </w:ins>
       <w:ins w:id="1088" w:author="PR Preview" w:date="2024-01-01T00:00:00Z">
         <w:r>
-          <w:t xml:space="preserve">de33cbe</w:t>
+          <w:t xml:space="preserve">54907b8</w:t>
         </w:r>
       </w:ins>
     </w:p>
@@ -32287,7 +32287,7 @@
       </w:ins>
       <w:ins w:id="1089" w:author="PR Preview" w:date="2024-01-01T00:00:00Z">
         <w:r>
-          <w:t xml:space="preserve">de33cbe0ccf22472f9f0d8a07f378e2d2eb21acb</w:t>
+          <w:t xml:space="preserve">54907b802e28c125ef72e3ed5aa98aefa82c227f</w:t>
         </w:r>
       </w:ins>
     </w:p>
@@ -32315,7 +32315,7 @@
       </w:ins>
       <w:ins w:id="1090" w:author="PR Preview" w:date="2024-01-01T00:00:00Z">
         <w:r>
-          <w:t xml:space="preserve">2026-10-10 09:15:22 +0000</w:t>
+          <w:t xml:space="preserve">2026-10-10 18:57:36 +0000</w:t>
         </w:r>
       </w:ins>
     </w:p>

</xml_diff>